<commit_message>
Kurs loyihasi: soda ishlab chiqarishning absorbsiya bo'limi (10 t/sutka); qalin matndagi indekslar tuzatildi
Co-Authored-By: Claude Opus 5.5 <noreply@anthropic.com>
Claude-Session: https://claude.ai/code/session_01WiKMKXbdYG9yT4fyQfVdjp
</commit_message>
<xml_diff>
--- a/kurs_loyiha/Metan_konvertori_kurs_loyihasi.docx
+++ b/kurs_loyiha/Metan_konvertori_kurs_loyihasi.docx
@@ -9425,7 +9425,28 @@
           <w:sz w:val="28"/>
           <w:szCs w:val="28"/>
         </w:rPr>
-        <w:t xml:space="preserve">5. Metanni CO_{2} bilan konversiyalash (quruq riforming).</w:t>
+        <w:t xml:space="preserve">5. Metanni CO</w:t>
+      </w:r>
+      <w:r>
+        <w:rPr>
+          <w:rFonts w:ascii="Times New Roman" w:cs="Times New Roman" w:eastAsia="Times New Roman" w:hAnsi="Times New Roman"/>
+          <w:b/>
+          <w:bCs/>
+          <w:sz w:val="28"/>
+          <w:szCs w:val="28"/>
+          <w:vertAlign w:val="subscript"/>
+        </w:rPr>
+        <w:t xml:space="preserve">2</w:t>
+      </w:r>
+      <w:r>
+        <w:rPr>
+          <w:rFonts w:ascii="Times New Roman" w:cs="Times New Roman" w:eastAsia="Times New Roman" w:hAnsi="Times New Roman"/>
+          <w:b/>
+          <w:bCs/>
+          <w:sz w:val="28"/>
+          <w:szCs w:val="28"/>
+        </w:rPr>
+        <w:t xml:space="preserve"> bilan konversiyalash (quruq riforming).</w:t>
       </w:r>
       <w:r>
         <w:rPr>

</xml_diff>